<commit_message>
Regenerate shift state fix DOCX with close-day-date test result
Co-authored-by: Sonic-Media <Sonic-Media@users.noreply.github.com>
</commit_message>
<xml_diff>
--- a/docs/data-integrity/STAFF-SHIFT-STATE-CONSISTENCY-FIX-REPORT.docx
+++ b/docs/data-integrity/STAFF-SHIFT-STATE-CONSISTENCY-FIX-REPORT.docx
@@ -549,6 +549,14 @@
     </w:p>
     <w:p>
       <w:pPr>
+        <w:pStyle w:val="IntenseQuote"/>
+      </w:pPr>
+      <w:r>
+        <w:t>| `npm run verify:close-day-date` | **PASS** (16 checks) |</w:t>
+      </w:r>
+    </w:p>
+    <w:p>
+      <w:pPr>
         <w:pStyle w:val="Heading2"/>
       </w:pPr>
       <w:r>
@@ -574,14 +582,6 @@
       </w:pPr>
       <w:r>
         <w:t>| `npm run verify:attendance` | **FAIL** — close submit returned 403 forbidden (cashier lacks approve-close permission); test expects 409 staff_on_shift. Pre-existing test/API mismatch, not caused by this fix. |</w:t>
-      </w:r>
-    </w:p>
-    <w:p>
-      <w:pPr>
-        <w:pStyle w:val="IntenseQuote"/>
-      </w:pPr>
-      <w:r>
-        <w:t>| `npm run verify:close-day-date` | **Not fully run in this session** — prior runs showed static checks pass; live cashier bootstrap may fail with auth fixture |</w:t>
       </w:r>
     </w:p>
     <w:p>

</xml_diff>